<commit_message>
made changes, added link
</commit_message>
<xml_diff>
--- a/week8-lab3/replication-lab.docx
+++ b/week8-lab3/replication-lab.docx
@@ -34,7 +34,7 @@
         <w:t xml:space="preserve">2026-10-25</w:t>
       </w:r>
     </w:p>
-    <w:bookmarkStart w:id="9" w:name="study-and-replication-question"/>
+    <w:bookmarkStart w:id="10" w:name="study-and-replication-question"/>
     <w:p>
       <w:pPr>
         <w:pStyle w:val="Heading1"/>
@@ -52,52 +52,59 @@
           <w:b/>
           <w:bCs/>
         </w:rPr>
-        <w:t xml:space="preserve">Article:</w:t>
+        <w:t xml:space="preserve">Author:</w:t>
       </w:r>
       <w:r>
         <w:t xml:space="preserve"> </w:t>
       </w:r>
       <w:r>
-        <w:rPr>
-          <w:i/>
-          <w:iCs/>
-        </w:rPr>
-        <w:t xml:space="preserve">WILDS: A Benchmark of in-the-Wild Distribution Shifts</w:t>
-      </w:r>
-      <w:r>
-        <w:t xml:space="preserve">, Koh et al. (2021), ICML/PMLR 139, 5637–5664.</w:t>
-      </w:r>
-      <w:r>
-        <w:t xml:space="preserve"> </w:t>
+        <w:t xml:space="preserve">Urmi Rani Biswas</w:t>
+      </w:r>
+      <w:r>
+        <w:br/>
       </w:r>
       <w:r>
         <w:rPr>
           <w:b/>
           <w:bCs/>
         </w:rPr>
-        <w:t xml:space="preserve">Strategy:</w:t>
+        <w:t xml:space="preserve">Source code and reproducibility materials:</w:t>
       </w:r>
       <w:r>
         <w:t xml:space="preserve"> </w:t>
       </w:r>
-      <w:r>
-        <w:t xml:space="preserve">Partial replication.</w:t>
-      </w:r>
-      <w:r>
-        <w:t xml:space="preserve"> </w:t>
+      <w:hyperlink r:id="rId9">
+        <w:r>
+          <w:rPr>
+            <w:rStyle w:val="Hyperlink"/>
+          </w:rPr>
+          <w:t xml:space="preserve">github.com/urmi987/week-8-lab-3</w:t>
+        </w:r>
+      </w:hyperlink>
+      <w:r>
+        <w:br/>
       </w:r>
       <w:r>
         <w:rPr>
           <w:b/>
           <w:bCs/>
         </w:rPr>
-        <w:t xml:space="preserve">Question:</w:t>
+        <w:t xml:space="preserve">Analysis directory:</w:t>
       </w:r>
       <w:r>
         <w:t xml:space="preserve"> </w:t>
       </w:r>
       <w:r>
-        <w:t xml:space="preserve">Does a single toxicity classifier generalize equally well to held-out comments with and without a Muslim-identity annotation when only the latter environment is represented in training?</w:t>
+        <w:rPr>
+          <w:rStyle w:val="VerbatimChar"/>
+        </w:rPr>
+        <w:t xml:space="preserve">week8-lab3/</w:t>
+      </w:r>
+      <w:r>
+        <w:t xml:space="preserve"> </w:t>
+      </w:r>
+      <w:r>
+        <w:t xml:space="preserve">in the repository.</w:t>
       </w:r>
     </w:p>
     <w:p>
@@ -105,11 +112,68 @@
         <w:pStyle w:val="BodyText"/>
       </w:pPr>
       <w:r>
+        <w:rPr>
+          <w:b/>
+          <w:bCs/>
+        </w:rPr>
+        <w:t xml:space="preserve">Article:</w:t>
+      </w:r>
+      <w:r>
+        <w:t xml:space="preserve"> </w:t>
+      </w:r>
+      <w:r>
+        <w:rPr>
+          <w:i/>
+          <w:iCs/>
+        </w:rPr>
+        <w:t xml:space="preserve">WILDS: A Benchmark of in-the-Wild Distribution Shifts</w:t>
+      </w:r>
+      <w:r>
+        <w:t xml:space="preserve">, Koh et al. (2021), ICML/PMLR 139, 5637–5664.</w:t>
+      </w:r>
+      <w:r>
+        <w:t xml:space="preserve"> </w:t>
+      </w:r>
+      <w:r>
+        <w:rPr>
+          <w:b/>
+          <w:bCs/>
+        </w:rPr>
+        <w:t xml:space="preserve">Strategy:</w:t>
+      </w:r>
+      <w:r>
+        <w:t xml:space="preserve"> </w:t>
+      </w:r>
+      <w:r>
+        <w:t xml:space="preserve">Partial replication.</w:t>
+      </w:r>
+      <w:r>
+        <w:t xml:space="preserve"> </w:t>
+      </w:r>
+      <w:r>
+        <w:rPr>
+          <w:b/>
+          <w:bCs/>
+        </w:rPr>
+        <w:t xml:space="preserve">Question:</w:t>
+      </w:r>
+      <w:r>
+        <w:t xml:space="preserve"> </w:t>
+      </w:r>
+      <w:r>
+        <w:t xml:space="preserve">Does a single toxicity classifier generalize equally well to held-out comments with and without a Muslim-identity annotation when only the latter environment is represented in training?</w:t>
+      </w:r>
+    </w:p>
+    <w:p>
+      <w:pPr>
+        <w:pStyle w:val="BodyText"/>
+      </w:pPr>
+      <w:r>
         <w:t xml:space="preserve">The course starter is a general scholarly-report template. It supplies no dataset, model, or Week 8 split. The choices below operationalize the assignment using original CivilComments-WILDS data and an adapted, explicitly documented experiment. They are analyst choices, not instructor-prescribed settings.</w:t>
       </w:r>
     </w:p>
-    <w:bookmarkEnd w:id="9"/>
-    <w:bookmarkStart w:id="10" w:name="research-claim"/>
+    <w:bookmarkEnd w:id="10"/>
+    <w:bookmarkStart w:id="11" w:name="research-claim"/>
     <w:p>
       <w:pPr>
         <w:pStyle w:val="Heading1"/>
@@ -168,8 +232,8 @@
         <w:t xml:space="preserve">The target claim here is that strong performance in a development-like population does not guarantee comparable performance in a population poorly represented during development. Accuracy is the primary metric, supplemented by balanced accuracy, discrimination, error rates, and calibration evidence. The experiment retains one fitted pipeline while changing only the evaluation population. It investigates a scoped generalization claim rather than attempting to establish that all shifts necessarily reduce accuracy or to reproduce the entire benchmark.</w:t>
       </w:r>
     </w:p>
-    <w:bookmarkEnd w:id="10"/>
-    <w:bookmarkStart w:id="11" w:name="replication-strategy"/>
+    <w:bookmarkEnd w:id="11"/>
+    <w:bookmarkStart w:id="12" w:name="replication-strategy"/>
     <w:p>
       <w:pPr>
         <w:pStyle w:val="Heading1"/>
@@ -225,8 +289,8 @@
         <w:t xml:space="preserve">The model is a lightweight TF-IDF/logistic classifier rather than the paper’s DistilBERT baseline. We exclude shifted-environment rows from development and divide the original test split into two disjoint evaluation environments. Consequently, a qualitative pattern can support the paper’s methodological concern, but numerical equivalence to its results is not expected. No alternative identity, model, or threshold is selected after examining test performance.</w:t>
       </w:r>
     </w:p>
-    <w:bookmarkEnd w:id="11"/>
-    <w:bookmarkStart w:id="14" w:name="data-and-environments"/>
+    <w:bookmarkEnd w:id="12"/>
+    <w:bookmarkStart w:id="15" w:name="data-and-environments"/>
     <w:p>
       <w:pPr>
         <w:pStyle w:val="Heading1"/>
@@ -274,7 +338,7 @@
       <w:r>
         <w:t xml:space="preserve"> </w:t>
       </w:r>
-      <w:hyperlink r:id="rId12">
+      <w:hyperlink r:id="rId13">
         <w:r>
           <w:rPr>
             <w:rStyle w:val="Hyperlink"/>
@@ -300,7 +364,7 @@
       <w:r>
         <w:t xml:space="preserve"> </w:t>
       </w:r>
-      <w:hyperlink r:id="rId13">
+      <w:hyperlink r:id="rId14">
         <w:r>
           <w:rPr>
             <w:rStyle w:val="Hyperlink"/>
@@ -652,8 +716,8 @@
         <w:t xml:space="preserve">original test rows at or above that threshold. Thus ID means development-like with respect to this operational definition; it does not prove identical distributions in every other respect. Below-threshold comments may still contain Muslim-related language. The shifted domain is absent according to the annotation rule, not necessarily absent in every lexical or semantic sense.</w:t>
       </w:r>
     </w:p>
-    <w:bookmarkEnd w:id="14"/>
-    <w:bookmarkStart w:id="15" w:name="method"/>
+    <w:bookmarkEnd w:id="15"/>
+    <w:bookmarkStart w:id="16" w:name="method"/>
     <w:p>
       <w:pPr>
         <w:pStyle w:val="Heading1"/>
@@ -705,8 +769,8 @@
         <w:t xml:space="preserve">Accuracy measures overall classification, balanced accuracy averages class-specific recall, and ROC AUC measures ranking. Toxic recall and false-positive rate expose asymmetric moderation errors. Brier score is mean squared probability error; lower is better. Expected calibration error (ECE) uses ten equal-width probability bins and is descriptive, not a complete calibration test. An independent within-environment row bootstrap with 1,000 draws estimates uncertainty in shifted-minus-ID accuracy conditional on this fitted model. It does not capture training variability or dependence among comments from the same discussion.</w:t>
       </w:r>
     </w:p>
-    <w:bookmarkEnd w:id="15"/>
-    <w:bookmarkStart w:id="18" w:name="results-one-model-two-environments"/>
+    <w:bookmarkEnd w:id="16"/>
+    <w:bookmarkStart w:id="19" w:name="results-one-model-two-environments"/>
     <w:p>
       <w:pPr>
         <w:pStyle w:val="Heading1"/>
@@ -1210,7 +1274,7 @@
         <w:t xml:space="preserve">, by -14.87 percentage points. The high ID accuracy already hides low sensitivity: the model misses 67.11% of toxic ID comments and 81.98% of toxic shifted comments. ROC AUC also drops from 0.9121 to 0.7900, so the contrast is not confined to the chosen 0.5 threshold. Comparing AUC or Brier changes directly with percentage-point changes would mix different scales.</w:t>
       </w:r>
     </w:p>
-    <w:bookmarkStart w:id="16" w:name="look-beneath-the-average"/>
+    <w:bookmarkStart w:id="17" w:name="look-beneath-the-average"/>
     <w:p>
       <w:pPr>
         <w:pStyle w:val="Heading2"/>
@@ -2143,8 +2207,8 @@
         <w:t xml:space="preserve">. Within a true-toxic cell, accuracy equals toxic recall; within a nontoxic cell it equals specificity. These cells reveal errors that identity-level averages can conceal.</w:t>
       </w:r>
     </w:p>
-    <w:bookmarkEnd w:id="16"/>
-    <w:bookmarkStart w:id="17" w:name="diagnose-before-retraining"/>
+    <w:bookmarkEnd w:id="17"/>
+    <w:bookmarkStart w:id="18" w:name="diagnose-before-retraining"/>
     <w:p>
       <w:pPr>
         <w:pStyle w:val="Heading2"/>
@@ -2438,9 +2502,9 @@
         <w:t xml:space="preserve">The proportion of evaluation unigram/bigram occurrences outside the retained training vocabulary is 25.99% ID and 27.18% shifted. This rate includes rare terms omitted by the 50,000-feature cap and is not simply the fraction of unseen words. Identity-annotated content is poorly represented by design, but annotation differences, context, sarcasm, and label ambiguity can also explain errors. Both environments use the same dataset schema and rating framework; this experiment does not independently audit annotation practices or demonstrate a change in measurement. It also cannot determine from aggregate diagnostics alone whether the conditional predictor–outcome relationship changed.</w:t>
       </w:r>
     </w:p>
-    <w:bookmarkEnd w:id="17"/>
     <w:bookmarkEnd w:id="18"/>
-    <w:bookmarkStart w:id="21" w:name="compare-with-the-original-study"/>
+    <w:bookmarkEnd w:id="19"/>
+    <w:bookmarkStart w:id="22" w:name="compare-with-the-original-study"/>
     <w:p>
       <w:pPr>
         <w:pStyle w:val="Heading1"/>
@@ -2721,7 +2785,7 @@
         <w:t xml:space="preserve">The empirical comparison asks whether environment-sensitive evaluation changes the judgment of one model. Any agreement in direction supports that limited methodological insight. It does not reproduce DistilBERT’s performance, establish a benchmark improvement, or estimate how much all naturally occurring shifts degrade models. Differences arise from architecture, deliberately excluded training content, deduplication, class composition, and evaluation definition. Unlike the paper’s original subpopulation evaluation, our design turns one annotation dimension into an explicit held-out environment; that makes the laboratory contrast clear but narrows external validity. The identity-by-label analysis connects the result back to WILDS’ warning that averages can conceal local failures.</w:t>
       </w:r>
     </w:p>
-    <w:bookmarkStart w:id="19" w:name="deployment-judgment-revalidate"/>
+    <w:bookmarkStart w:id="20" w:name="deployment-judgment-revalidate"/>
     <w:p>
       <w:pPr>
         <w:pStyle w:val="Heading2"/>
@@ -2738,8 +2802,8 @@
         <w:t xml:space="preserve">The available evidence does not justify relying on development-like accuracy for the shifted population. Before deployment, obtain a representative, independently labeled sample from the intended moderation setting and predefine acceptable false-positive and false-negative costs with affected stakeholders. Validate calibration, identity-by-label error rates, and threshold choices on a separate validation sample; keep a final evaluation sample untouched. If a system is later introduced, route uncertain or consequential decisions to human review, monitor errors by environment, and provide an appeal mechanism. These safeguards require their own evaluation; they do not repair the measured errors automatically.</w:t>
       </w:r>
     </w:p>
-    <w:bookmarkEnd w:id="19"/>
-    <w:bookmarkStart w:id="20" w:name="limits-of-the-experiment"/>
+    <w:bookmarkEnd w:id="20"/>
+    <w:bookmarkStart w:id="21" w:name="limits-of-the-experiment"/>
     <w:p>
       <w:pPr>
         <w:pStyle w:val="Heading2"/>
@@ -2756,15 +2820,52 @@
         <w:t xml:space="preserve">This is one annotation-defined shift, one model configuration, and one seed. It cannot establish causal discrimination, author-level fairness, performance on other religions or languages, chronological transportability, or real moderation outcomes. Crowd labels may reflect disagreement or annotation bias. Deduplication removes exact normalized matches but not near duplicates, common articles, or conversation dependencies. The row bootstrap may understate uncertainty when comments are clustered by article or publication. ECE depends on binning, and Brier score reflects both prevalence and probability quality. No held-out deployment data, human baseline, multi-seed model variation, or intervention evaluation is available. These limits motivate revalidation even if some aggregate metrics appear favorable.</w:t>
       </w:r>
     </w:p>
-    <w:bookmarkEnd w:id="20"/>
     <w:bookmarkEnd w:id="21"/>
-    <w:bookmarkStart w:id="23" w:name="reproducibility-check"/>
+    <w:bookmarkEnd w:id="22"/>
+    <w:bookmarkStart w:id="24" w:name="reproducibility-check"/>
     <w:p>
       <w:pPr>
         <w:pStyle w:val="Heading1"/>
       </w:pPr>
       <w:r>
         <w:t xml:space="preserve">7. Reproducibility check</w:t>
+      </w:r>
+    </w:p>
+    <w:p>
+      <w:pPr>
+        <w:pStyle w:val="FirstParagraph"/>
+      </w:pPr>
+      <w:r>
+        <w:t xml:space="preserve">The source repository for this submission is</w:t>
+      </w:r>
+      <w:r>
+        <w:t xml:space="preserve"> </w:t>
+      </w:r>
+      <w:hyperlink r:id="rId9">
+        <w:r>
+          <w:rPr>
+            <w:rStyle w:val="Hyperlink"/>
+          </w:rPr>
+          <w:t xml:space="preserve">Urmi Rani Biswas — Week 8 Lab 3</w:t>
+        </w:r>
+      </w:hyperlink>
+      <w:r>
+        <w:t xml:space="preserve">. The</w:t>
+      </w:r>
+      <w:r>
+        <w:t xml:space="preserve"> </w:t>
+      </w:r>
+      <w:r>
+        <w:rPr>
+          <w:rStyle w:val="VerbatimChar"/>
+        </w:rPr>
+        <w:t xml:space="preserve">week8-lab3/</w:t>
+      </w:r>
+      <w:r>
+        <w:t xml:space="preserve"> </w:t>
+      </w:r>
+      <w:r>
+        <w:t xml:space="preserve">directory contains the Quarto source, analysis and data-download scripts, protocol, dependency lock, and saved results. Its README provides the reproduction commands; the raw dataset is obtained separately using the documented download script.</w:t>
       </w:r>
     </w:p>
     <w:p>
@@ -2883,7 +2984,7 @@
         <w:t xml:space="preserve">The main reproducibility challenge was infrastructure rather than model optimization: the original CodaLab data endpoint failed certificate validation, requiring a pinned public mirror and a recorded checksum. The starter repository is a writing template rather than an executable WILDS laboratory. Making that distinction explicit prevents undocumented assumptions about a prescribed model or split. Reproducing the report therefore requires both the data-acquisition instructions and the analytical protocol, not merely the template. Package locks document this run; other operating systems may require compatible binary packages.</w:t>
       </w:r>
     </w:p>
-    <w:bookmarkStart w:id="22" w:name="session-information"/>
+    <w:bookmarkStart w:id="23" w:name="session-information"/>
     <w:p>
       <w:pPr>
         <w:pStyle w:val="Heading2"/>
@@ -3200,9 +3301,9 @@
         </w:tc>
       </w:tr>
     </w:tbl>
-    <w:bookmarkEnd w:id="22"/>
     <w:bookmarkEnd w:id="23"/>
-    <w:bookmarkStart w:id="24" w:name="extension"/>
+    <w:bookmarkEnd w:id="24"/>
+    <w:bookmarkStart w:id="25" w:name="extension"/>
     <w:p>
       <w:pPr>
         <w:pStyle w:val="Heading1"/>
@@ -3219,8 +3320,8 @@
         <w:t xml:space="preserve">A feasible extension is a preregistered learning-curve experiment that introduces small, increasing amounts of Muslim-annotated development data while holding the total training size, model, and features fixed. Sample these additions only from the original training split, and reserve an independent validation subset for any threshold or calibration decisions. Repeat the experiment over several training seeds, evaluate the unchanged final test environments once the design is fixed, and use article-clustered bootstrap intervals where identifiers permit. Track toxic recall, nontoxic specificity, calibration, and the worst identity-by-label cells. This would investigate whether lack of representation explains the observed failure, whether improvement transfers to overlapping identity groups, and whether benefits require substantially more labeled data. It would add evidence about a concrete mechanism rather than simply comparing a larger collection of algorithms.</w:t>
       </w:r>
     </w:p>
-    <w:bookmarkEnd w:id="24"/>
-    <w:bookmarkStart w:id="26" w:name="replication-verdict"/>
+    <w:bookmarkEnd w:id="25"/>
+    <w:bookmarkStart w:id="27" w:name="replication-verdict"/>
     <w:p>
       <w:pPr>
         <w:pStyle w:val="Heading1"/>
@@ -3247,7 +3348,7 @@
         <w:t xml:space="preserve">The experiment tests WILDS’ concern about environment-sensitive generalization using original data and one fixed model, while the subgroup analysis checks whether aggregate evidence conceals local errors. It is a partial methodological replication, not a numerical reproduction of the published CivilComments benchmark; the results and limitations above define the scope of the verdict.</w:t>
       </w:r>
     </w:p>
-    <w:bookmarkStart w:id="25" w:name="research-transparency"/>
+    <w:bookmarkStart w:id="26" w:name="research-transparency"/>
     <w:p>
       <w:pPr>
         <w:pStyle w:val="Heading2"/>
@@ -3264,9 +3365,9 @@
         <w:t xml:space="preserve">AI assistance was used to inspect the supplied materials, implement the analysis, and draft the report. The executable checks and saved results make the analytical decisions reviewable. The student remains responsible for checking the work, understanding the environment definition and metric tradeoffs, and defending the interpretation before submission. No independent student review is claimed here.</w:t>
       </w:r>
     </w:p>
-    <w:bookmarkEnd w:id="25"/>
     <w:bookmarkEnd w:id="26"/>
-    <w:bookmarkStart w:id="32" w:name="references"/>
+    <w:bookmarkEnd w:id="27"/>
+    <w:bookmarkStart w:id="33" w:name="references"/>
     <w:p>
       <w:pPr>
         <w:pStyle w:val="Heading1"/>
@@ -3275,8 +3376,8 @@
         <w:t xml:space="preserve">References</w:t>
       </w:r>
     </w:p>
-    <w:bookmarkStart w:id="31" w:name="refs"/>
-    <w:bookmarkStart w:id="28" w:name="ref-borkan2019"/>
+    <w:bookmarkStart w:id="32" w:name="refs"/>
+    <w:bookmarkStart w:id="29" w:name="ref-borkan2019"/>
     <w:p>
       <w:pPr>
         <w:pStyle w:val="Bibliography"/>
@@ -3306,7 +3407,7 @@
       <w:r>
         <w:t xml:space="preserve"> </w:t>
       </w:r>
-      <w:hyperlink r:id="rId27">
+      <w:hyperlink r:id="rId28">
         <w:r>
           <w:rPr>
             <w:rStyle w:val="Hyperlink"/>
@@ -3318,8 +3419,8 @@
         <w:t xml:space="preserve">.</w:t>
       </w:r>
     </w:p>
-    <w:bookmarkEnd w:id="28"/>
-    <w:bookmarkStart w:id="30" w:name="ref-koh2021wilds"/>
+    <w:bookmarkEnd w:id="29"/>
+    <w:bookmarkStart w:id="31" w:name="ref-koh2021wilds"/>
     <w:p>
       <w:pPr>
         <w:pStyle w:val="Bibliography"/>
@@ -3358,7 +3459,7 @@
       <w:r>
         <w:t xml:space="preserve"> </w:t>
       </w:r>
-      <w:hyperlink r:id="rId29">
+      <w:hyperlink r:id="rId30">
         <w:r>
           <w:rPr>
             <w:rStyle w:val="Hyperlink"/>
@@ -3370,10 +3471,10 @@
         <w:t xml:space="preserve">.</w:t>
       </w:r>
     </w:p>
-    <w:bookmarkEnd w:id="30"/>
     <w:bookmarkEnd w:id="31"/>
     <w:bookmarkEnd w:id="32"/>
-    <w:bookmarkStart w:id="33" w:name="appendix-executable-analysis"/>
+    <w:bookmarkEnd w:id="33"/>
+    <w:bookmarkStart w:id="34" w:name="appendix-executable-analysis"/>
     <w:p>
       <w:pPr>
         <w:pStyle w:val="Heading1"/>
@@ -10577,7 +10678,7 @@
         <w:t xml:space="preserve">    run()</w:t>
       </w:r>
     </w:p>
-    <w:bookmarkEnd w:id="33"/>
+    <w:bookmarkEnd w:id="34"/>
     <w:sectPr>
       <w:footnotePr>
         <w:numRestart w:val="eachSect"/>

</xml_diff>